<commit_message>
Add video-walkthrough callouts to the client guide
Six placements where a short screen recording earns its keep for a
non-technical reader:

  - Getting started — first login + studio tour
  - Editing & publishing — your first edit, end to end
  - Media library — bulk upload, tag, pick from library
  - Projects collection — re-ordering by drag-and-drop
  - Tips & gotchas — setting an image hotspot
  - Tips & gotchas — rolling back to a previous version

URLs live in a single `VIDEOS` config block at the top of the
generator — paste a link, re-run, the callout goes from "Link
coming soon" to a clickable "Watch →". No code edits per video.

Also: writeFileSync falls through to a -v<N> sibling when the
canonical file is locked (Word open), so the build never silently
fails.

Co-Authored-By: Claude Opus 4.7 (1M context) <noreply@anthropic.com>
</commit_message>
<xml_diff>
--- a/box-3-sanity-editing-guide.docx
+++ b/box-3-sanity-editing-guide.docx
@@ -190,7 +190,7 @@
       <w:pPr>
         <w:spacing w:after="120"/>
       </w:pPr>
-      <w:hyperlink w:history="1" r:id="rIdjc1wwmlnts-1fjgvuqayc">
+      <w:hyperlink w:history="1" r:id="rId7gcdlmzuyrtq8jkwkqlkg">
         <w:r>
           <w:rPr>
             <w:rFonts w:ascii="Arial" w:cs="Arial" w:eastAsia="Arial" w:hAnsi="Arial"/>
@@ -309,6 +309,83 @@
       </w:tr>
     </w:tbl>
     <w:p>
+      <w:pPr>
+        <w:spacing w:after="120"/>
+      </w:pPr>
+      <w:r>
+        <w:t xml:space="preserve"/>
+      </w:r>
+    </w:p>
+    <w:tbl>
+      <w:tblPr>
+        <w:tblW w:type="dxa" w:w="9360"/>
+        <w:tblBorders>
+          <w:top w:val="single" w:color="auto" w:sz="4"/>
+          <w:left w:val="single" w:color="auto" w:sz="4"/>
+          <w:bottom w:val="single" w:color="auto" w:sz="4"/>
+          <w:right w:val="single" w:color="auto" w:sz="4"/>
+          <w:insideH w:val="single" w:color="auto" w:sz="4"/>
+          <w:insideV w:val="single" w:color="auto" w:sz="4"/>
+        </w:tblBorders>
+      </w:tblPr>
+      <w:tblGrid>
+        <w:gridCol w:w="9360"/>
+      </w:tblGrid>
+      <w:tr>
+        <w:tc>
+          <w:tcPr>
+            <w:tcW w:type="dxa" w:w="9360"/>
+            <w:tcBorders>
+              <w:top w:val="single" w:color="2F7D49" w:sz="6"/>
+              <w:left w:val="single" w:color="2F7D49" w:sz="6"/>
+              <w:bottom w:val="single" w:color="2F7D49" w:sz="6"/>
+              <w:right w:val="single" w:color="2F7D49" w:sz="6"/>
+            </w:tcBorders>
+            <w:shd w:fill="EAF4ED" w:val="clear"/>
+            <w:tcMar>
+              <w:top w:type="dxa" w:w="120"/>
+              <w:left w:type="dxa" w:w="200"/>
+              <w:bottom w:type="dxa" w:w="120"/>
+              <w:right w:type="dxa" w:w="200"/>
+            </w:tcMar>
+          </w:tcPr>
+          <w:p>
+            <w:pPr>
+              <w:spacing w:after="80"/>
+            </w:pPr>
+            <w:r>
+              <w:rPr>
+                <w:rFonts w:ascii="Arial" w:cs="Arial" w:eastAsia="Arial" w:hAnsi="Arial"/>
+                <w:b/>
+                <w:bCs/>
+                <w:color w:val="2F7D49"/>
+                <w:sz w:val="22"/>
+                <w:szCs w:val="22"/>
+              </w:rPr>
+              <w:t xml:space="preserve">▶  Video — first login + studio tour</w:t>
+            </w:r>
+          </w:p>
+          <w:p>
+            <w:r>
+              <w:rPr>
+                <w:rFonts w:ascii="Arial" w:cs="Arial" w:eastAsia="Arial" w:hAnsi="Arial"/>
+              </w:rPr>
+              <w:t xml:space="preserve">A 2-minute walkthrough showing how to sign in and the basics of where everything lives.</w:t>
+            </w:r>
+            <w:r>
+              <w:rPr>
+                <w:rFonts w:ascii="Arial" w:cs="Arial" w:eastAsia="Arial" w:hAnsi="Arial"/>
+                <w:i/>
+                <w:iCs/>
+                <w:color w:val="555555"/>
+              </w:rPr>
+              <w:t xml:space="preserve">  (Video link coming soon — your studio team will send it.)</w:t>
+            </w:r>
+          </w:p>
+        </w:tc>
+      </w:tr>
+    </w:tbl>
+    <w:p>
       <w:r>
         <w:br w:type="page"/>
       </w:r>
@@ -1076,6 +1153,83 @@
       </w:tr>
     </w:tbl>
     <w:p>
+      <w:pPr>
+        <w:spacing w:after="120"/>
+      </w:pPr>
+      <w:r>
+        <w:t xml:space="preserve"/>
+      </w:r>
+    </w:p>
+    <w:tbl>
+      <w:tblPr>
+        <w:tblW w:type="dxa" w:w="9360"/>
+        <w:tblBorders>
+          <w:top w:val="single" w:color="auto" w:sz="4"/>
+          <w:left w:val="single" w:color="auto" w:sz="4"/>
+          <w:bottom w:val="single" w:color="auto" w:sz="4"/>
+          <w:right w:val="single" w:color="auto" w:sz="4"/>
+          <w:insideH w:val="single" w:color="auto" w:sz="4"/>
+          <w:insideV w:val="single" w:color="auto" w:sz="4"/>
+        </w:tblBorders>
+      </w:tblPr>
+      <w:tblGrid>
+        <w:gridCol w:w="9360"/>
+      </w:tblGrid>
+      <w:tr>
+        <w:tc>
+          <w:tcPr>
+            <w:tcW w:type="dxa" w:w="9360"/>
+            <w:tcBorders>
+              <w:top w:val="single" w:color="2F7D49" w:sz="6"/>
+              <w:left w:val="single" w:color="2F7D49" w:sz="6"/>
+              <w:bottom w:val="single" w:color="2F7D49" w:sz="6"/>
+              <w:right w:val="single" w:color="2F7D49" w:sz="6"/>
+            </w:tcBorders>
+            <w:shd w:fill="EAF4ED" w:val="clear"/>
+            <w:tcMar>
+              <w:top w:type="dxa" w:w="120"/>
+              <w:left w:type="dxa" w:w="200"/>
+              <w:bottom w:type="dxa" w:w="120"/>
+              <w:right w:type="dxa" w:w="200"/>
+            </w:tcMar>
+          </w:tcPr>
+          <w:p>
+            <w:pPr>
+              <w:spacing w:after="80"/>
+            </w:pPr>
+            <w:r>
+              <w:rPr>
+                <w:rFonts w:ascii="Arial" w:cs="Arial" w:eastAsia="Arial" w:hAnsi="Arial"/>
+                <w:b/>
+                <w:bCs/>
+                <w:color w:val="2F7D49"/>
+                <w:sz w:val="22"/>
+                <w:szCs w:val="22"/>
+              </w:rPr>
+              <w:t xml:space="preserve">▶  Video — your first edit, end to end</w:t>
+            </w:r>
+          </w:p>
+          <w:p>
+            <w:r>
+              <w:rPr>
+                <w:rFonts w:ascii="Arial" w:cs="Arial" w:eastAsia="Arial" w:hAnsi="Arial"/>
+              </w:rPr>
+              <w:t xml:space="preserve">Open a document, change a heading, publish it, check the live site. Shows you the safe loop you'll use for every change.</w:t>
+            </w:r>
+            <w:r>
+              <w:rPr>
+                <w:rFonts w:ascii="Arial" w:cs="Arial" w:eastAsia="Arial" w:hAnsi="Arial"/>
+                <w:i/>
+                <w:iCs/>
+                <w:color w:val="555555"/>
+              </w:rPr>
+              <w:t xml:space="preserve">  (Video link coming soon — your studio team will send it.)</w:t>
+            </w:r>
+          </w:p>
+        </w:tc>
+      </w:tr>
+    </w:tbl>
+    <w:p>
       <w:r>
         <w:br w:type="page"/>
       </w:r>
@@ -1396,6 +1550,83 @@
     </w:tbl>
     <w:p>
       <w:pPr>
+        <w:spacing w:after="120"/>
+      </w:pPr>
+      <w:r>
+        <w:t xml:space="preserve"/>
+      </w:r>
+    </w:p>
+    <w:tbl>
+      <w:tblPr>
+        <w:tblW w:type="dxa" w:w="9360"/>
+        <w:tblBorders>
+          <w:top w:val="single" w:color="auto" w:sz="4"/>
+          <w:left w:val="single" w:color="auto" w:sz="4"/>
+          <w:bottom w:val="single" w:color="auto" w:sz="4"/>
+          <w:right w:val="single" w:color="auto" w:sz="4"/>
+          <w:insideH w:val="single" w:color="auto" w:sz="4"/>
+          <w:insideV w:val="single" w:color="auto" w:sz="4"/>
+        </w:tblBorders>
+      </w:tblPr>
+      <w:tblGrid>
+        <w:gridCol w:w="9360"/>
+      </w:tblGrid>
+      <w:tr>
+        <w:tc>
+          <w:tcPr>
+            <w:tcW w:type="dxa" w:w="9360"/>
+            <w:tcBorders>
+              <w:top w:val="single" w:color="2F7D49" w:sz="6"/>
+              <w:left w:val="single" w:color="2F7D49" w:sz="6"/>
+              <w:bottom w:val="single" w:color="2F7D49" w:sz="6"/>
+              <w:right w:val="single" w:color="2F7D49" w:sz="6"/>
+            </w:tcBorders>
+            <w:shd w:fill="EAF4ED" w:val="clear"/>
+            <w:tcMar>
+              <w:top w:type="dxa" w:w="120"/>
+              <w:left w:type="dxa" w:w="200"/>
+              <w:bottom w:type="dxa" w:w="120"/>
+              <w:right w:type="dxa" w:w="200"/>
+            </w:tcMar>
+          </w:tcPr>
+          <w:p>
+            <w:pPr>
+              <w:spacing w:after="80"/>
+            </w:pPr>
+            <w:r>
+              <w:rPr>
+                <w:rFonts w:ascii="Arial" w:cs="Arial" w:eastAsia="Arial" w:hAnsi="Arial"/>
+                <w:b/>
+                <w:bCs/>
+                <w:color w:val="2F7D49"/>
+                <w:sz w:val="22"/>
+                <w:szCs w:val="22"/>
+              </w:rPr>
+              <w:t xml:space="preserve">▶  Video — bulk upload, tag, and pick from library</w:t>
+            </w:r>
+          </w:p>
+          <w:p>
+            <w:r>
+              <w:rPr>
+                <w:rFonts w:ascii="Arial" w:cs="Arial" w:eastAsia="Arial" w:hAnsi="Arial"/>
+              </w:rPr>
+              <w:t xml:space="preserve">The full workflow with a real folder of project photos: tag → drop → open the document → Pick from library.</w:t>
+            </w:r>
+            <w:r>
+              <w:rPr>
+                <w:rFonts w:ascii="Arial" w:cs="Arial" w:eastAsia="Arial" w:hAnsi="Arial"/>
+                <w:i/>
+                <w:iCs/>
+                <w:color w:val="555555"/>
+              </w:rPr>
+              <w:t xml:space="preserve">  (Video link coming soon — your studio team will send it.)</w:t>
+            </w:r>
+          </w:p>
+        </w:tc>
+      </w:tr>
+    </w:tbl>
+    <w:p>
+      <w:pPr>
         <w:pStyle w:val="Heading3"/>
       </w:pPr>
       <w:r>
@@ -9948,6 +10179,83 @@
     </w:tbl>
     <w:p>
       <w:pPr>
+        <w:spacing w:after="120"/>
+      </w:pPr>
+      <w:r>
+        <w:t xml:space="preserve"/>
+      </w:r>
+    </w:p>
+    <w:tbl>
+      <w:tblPr>
+        <w:tblW w:type="dxa" w:w="9360"/>
+        <w:tblBorders>
+          <w:top w:val="single" w:color="auto" w:sz="4"/>
+          <w:left w:val="single" w:color="auto" w:sz="4"/>
+          <w:bottom w:val="single" w:color="auto" w:sz="4"/>
+          <w:right w:val="single" w:color="auto" w:sz="4"/>
+          <w:insideH w:val="single" w:color="auto" w:sz="4"/>
+          <w:insideV w:val="single" w:color="auto" w:sz="4"/>
+        </w:tblBorders>
+      </w:tblPr>
+      <w:tblGrid>
+        <w:gridCol w:w="9360"/>
+      </w:tblGrid>
+      <w:tr>
+        <w:tc>
+          <w:tcPr>
+            <w:tcW w:type="dxa" w:w="9360"/>
+            <w:tcBorders>
+              <w:top w:val="single" w:color="2F7D49" w:sz="6"/>
+              <w:left w:val="single" w:color="2F7D49" w:sz="6"/>
+              <w:bottom w:val="single" w:color="2F7D49" w:sz="6"/>
+              <w:right w:val="single" w:color="2F7D49" w:sz="6"/>
+            </w:tcBorders>
+            <w:shd w:fill="EAF4ED" w:val="clear"/>
+            <w:tcMar>
+              <w:top w:type="dxa" w:w="120"/>
+              <w:left w:type="dxa" w:w="200"/>
+              <w:bottom w:type="dxa" w:w="120"/>
+              <w:right w:type="dxa" w:w="200"/>
+            </w:tcMar>
+          </w:tcPr>
+          <w:p>
+            <w:pPr>
+              <w:spacing w:after="80"/>
+            </w:pPr>
+            <w:r>
+              <w:rPr>
+                <w:rFonts w:ascii="Arial" w:cs="Arial" w:eastAsia="Arial" w:hAnsi="Arial"/>
+                <w:b/>
+                <w:bCs/>
+                <w:color w:val="2F7D49"/>
+                <w:sz w:val="22"/>
+                <w:szCs w:val="22"/>
+              </w:rPr>
+              <w:t xml:space="preserve">▶  Video — re-ordering projects</w:t>
+            </w:r>
+          </w:p>
+          <w:p>
+            <w:r>
+              <w:rPr>
+                <w:rFonts w:ascii="Arial" w:cs="Arial" w:eastAsia="Arial" w:hAnsi="Arial"/>
+              </w:rPr>
+              <w:t xml:space="preserve">How to drag rows to change the order on the site, including the knock-on effect on the home page and footer.</w:t>
+            </w:r>
+            <w:r>
+              <w:rPr>
+                <w:rFonts w:ascii="Arial" w:cs="Arial" w:eastAsia="Arial" w:hAnsi="Arial"/>
+                <w:i/>
+                <w:iCs/>
+                <w:color w:val="555555"/>
+              </w:rPr>
+              <w:t xml:space="preserve">  (Video link coming soon — your studio team will send it.)</w:t>
+            </w:r>
+          </w:p>
+        </w:tc>
+      </w:tr>
+    </w:tbl>
+    <w:p>
+      <w:pPr>
         <w:pStyle w:val="Heading3"/>
       </w:pPr>
       <w:r>
@@ -11579,6 +11887,83 @@
     </w:p>
     <w:p>
       <w:pPr>
+        <w:spacing w:after="120"/>
+      </w:pPr>
+      <w:r>
+        <w:t xml:space="preserve"/>
+      </w:r>
+    </w:p>
+    <w:tbl>
+      <w:tblPr>
+        <w:tblW w:type="dxa" w:w="9360"/>
+        <w:tblBorders>
+          <w:top w:val="single" w:color="auto" w:sz="4"/>
+          <w:left w:val="single" w:color="auto" w:sz="4"/>
+          <w:bottom w:val="single" w:color="auto" w:sz="4"/>
+          <w:right w:val="single" w:color="auto" w:sz="4"/>
+          <w:insideH w:val="single" w:color="auto" w:sz="4"/>
+          <w:insideV w:val="single" w:color="auto" w:sz="4"/>
+        </w:tblBorders>
+      </w:tblPr>
+      <w:tblGrid>
+        <w:gridCol w:w="9360"/>
+      </w:tblGrid>
+      <w:tr>
+        <w:tc>
+          <w:tcPr>
+            <w:tcW w:type="dxa" w:w="9360"/>
+            <w:tcBorders>
+              <w:top w:val="single" w:color="2F7D49" w:sz="6"/>
+              <w:left w:val="single" w:color="2F7D49" w:sz="6"/>
+              <w:bottom w:val="single" w:color="2F7D49" w:sz="6"/>
+              <w:right w:val="single" w:color="2F7D49" w:sz="6"/>
+            </w:tcBorders>
+            <w:shd w:fill="EAF4ED" w:val="clear"/>
+            <w:tcMar>
+              <w:top w:type="dxa" w:w="120"/>
+              <w:left w:type="dxa" w:w="200"/>
+              <w:bottom w:type="dxa" w:w="120"/>
+              <w:right w:type="dxa" w:w="200"/>
+            </w:tcMar>
+          </w:tcPr>
+          <w:p>
+            <w:pPr>
+              <w:spacing w:after="80"/>
+            </w:pPr>
+            <w:r>
+              <w:rPr>
+                <w:rFonts w:ascii="Arial" w:cs="Arial" w:eastAsia="Arial" w:hAnsi="Arial"/>
+                <w:b/>
+                <w:bCs/>
+                <w:color w:val="2F7D49"/>
+                <w:sz w:val="22"/>
+                <w:szCs w:val="22"/>
+              </w:rPr>
+              <w:t xml:space="preserve">▶  Video — setting an image hotspot</w:t>
+            </w:r>
+          </w:p>
+          <w:p>
+            <w:r>
+              <w:rPr>
+                <w:rFonts w:ascii="Arial" w:cs="Arial" w:eastAsia="Arial" w:hAnsi="Arial"/>
+              </w:rPr>
+              <w:t xml:space="preserve">Quick demo on a portrait that's used at three different crops — shows what changes when you move the hotspot.</w:t>
+            </w:r>
+            <w:r>
+              <w:rPr>
+                <w:rFonts w:ascii="Arial" w:cs="Arial" w:eastAsia="Arial" w:hAnsi="Arial"/>
+                <w:i/>
+                <w:iCs/>
+                <w:color w:val="555555"/>
+              </w:rPr>
+              <w:t xml:space="preserve">  (Video link coming soon — your studio team will send it.)</w:t>
+            </w:r>
+          </w:p>
+        </w:tc>
+      </w:tr>
+    </w:tbl>
+    <w:p>
+      <w:pPr>
         <w:pStyle w:val="Heading2"/>
       </w:pPr>
       <w:r>
@@ -11613,6 +11998,83 @@
         <w:t xml:space="preserve">. You can always get back to where you were.</w:t>
       </w:r>
     </w:p>
+    <w:p>
+      <w:pPr>
+        <w:spacing w:after="120"/>
+      </w:pPr>
+      <w:r>
+        <w:t xml:space="preserve"/>
+      </w:r>
+    </w:p>
+    <w:tbl>
+      <w:tblPr>
+        <w:tblW w:type="dxa" w:w="9360"/>
+        <w:tblBorders>
+          <w:top w:val="single" w:color="auto" w:sz="4"/>
+          <w:left w:val="single" w:color="auto" w:sz="4"/>
+          <w:bottom w:val="single" w:color="auto" w:sz="4"/>
+          <w:right w:val="single" w:color="auto" w:sz="4"/>
+          <w:insideH w:val="single" w:color="auto" w:sz="4"/>
+          <w:insideV w:val="single" w:color="auto" w:sz="4"/>
+        </w:tblBorders>
+      </w:tblPr>
+      <w:tblGrid>
+        <w:gridCol w:w="9360"/>
+      </w:tblGrid>
+      <w:tr>
+        <w:tc>
+          <w:tcPr>
+            <w:tcW w:type="dxa" w:w="9360"/>
+            <w:tcBorders>
+              <w:top w:val="single" w:color="2F7D49" w:sz="6"/>
+              <w:left w:val="single" w:color="2F7D49" w:sz="6"/>
+              <w:bottom w:val="single" w:color="2F7D49" w:sz="6"/>
+              <w:right w:val="single" w:color="2F7D49" w:sz="6"/>
+            </w:tcBorders>
+            <w:shd w:fill="EAF4ED" w:val="clear"/>
+            <w:tcMar>
+              <w:top w:type="dxa" w:w="120"/>
+              <w:left w:type="dxa" w:w="200"/>
+              <w:bottom w:type="dxa" w:w="120"/>
+              <w:right w:type="dxa" w:w="200"/>
+            </w:tcMar>
+          </w:tcPr>
+          <w:p>
+            <w:pPr>
+              <w:spacing w:after="80"/>
+            </w:pPr>
+            <w:r>
+              <w:rPr>
+                <w:rFonts w:ascii="Arial" w:cs="Arial" w:eastAsia="Arial" w:hAnsi="Arial"/>
+                <w:b/>
+                <w:bCs/>
+                <w:color w:val="2F7D49"/>
+                <w:sz w:val="22"/>
+                <w:szCs w:val="22"/>
+              </w:rPr>
+              <w:t xml:space="preserve">▶  Video — rolling back a version</w:t>
+            </w:r>
+          </w:p>
+          <w:p>
+            <w:r>
+              <w:rPr>
+                <w:rFonts w:ascii="Arial" w:cs="Arial" w:eastAsia="Arial" w:hAnsi="Arial"/>
+              </w:rPr>
+              <w:t xml:space="preserve">If you publish something you didn't mean to, here's how to find the previous version and restore it in under a minute.</w:t>
+            </w:r>
+            <w:r>
+              <w:rPr>
+                <w:rFonts w:ascii="Arial" w:cs="Arial" w:eastAsia="Arial" w:hAnsi="Arial"/>
+                <w:i/>
+                <w:iCs/>
+                <w:color w:val="555555"/>
+              </w:rPr>
+              <w:t xml:space="preserve">  (Video link coming soon — your studio team will send it.)</w:t>
+            </w:r>
+          </w:p>
+        </w:tc>
+      </w:tr>
+    </w:tbl>
     <w:p>
       <w:pPr>
         <w:pStyle w:val="Heading2"/>

</xml_diff>

<commit_message>
Remove the Alt text sub-field from every Sanity image field
Editors don't author alt — the option is gone from the Studio. Every
image field that previously had `fields: [{ name: "alt", ... }]`
(plus the shared HERO_IMAGE_FIELDS arrays on careersPage /
sustainabilityPage) is now a bare image with hotspot only.

The front-end already falls back to "" on missing alt for the
consumers that read it (ProjectsHero, ProjectGallery, ProjectHero,
ImageStripHero), so the build stays green.

Refreshed the editing guide to match — dropped the "Image alt text"
section and removed every "Alt text" mention from the per-field
descriptions.

Co-Authored-By: Claude Opus 4.7 (1M context) <noreply@anthropic.com>
</commit_message>
<xml_diff>
--- a/box-3-sanity-editing-guide.docx
+++ b/box-3-sanity-editing-guide.docx
@@ -190,7 +190,7 @@
       <w:pPr>
         <w:spacing w:after="120"/>
       </w:pPr>
-      <w:hyperlink w:history="1" r:id="rId7gcdlmzuyrtq8jkwkqlkg">
+      <w:hyperlink w:history="1" r:id="rIdy7jisinmbnxaxwewyjxli">
         <w:r>
           <w:rPr>
             <w:rFonts w:ascii="Arial" w:cs="Arial" w:eastAsia="Arial" w:hAnsi="Arial"/>
@@ -2078,56 +2078,6 @@
         <w:t xml:space="preserve">If a tag doesn't exist yet, you can create it on the fly when you tag an image.</w:t>
       </w:r>
     </w:p>
-    <w:p>
-      <w:pPr>
-        <w:pStyle w:val="Heading2"/>
-      </w:pPr>
-      <w:r>
-        <w:rPr>
-          <w:rFonts w:ascii="Arial" w:cs="Arial" w:eastAsia="Arial" w:hAnsi="Arial"/>
-        </w:rPr>
-        <w:t xml:space="preserve">Image alt text</w:t>
-      </w:r>
-    </w:p>
-    <w:p>
-      <w:pPr>
-        <w:spacing w:after="120"/>
-      </w:pPr>
-      <w:r>
-        <w:rPr>
-          <w:rFonts w:ascii="Arial" w:cs="Arial" w:eastAsia="Arial" w:hAnsi="Arial"/>
-        </w:rPr>
-        <w:t xml:space="preserve">Every image field on a document has an </w:t>
-      </w:r>
-      <w:r>
-        <w:rPr>
-          <w:rFonts w:ascii="Arial" w:cs="Arial" w:eastAsia="Arial" w:hAnsi="Arial"/>
-          <w:b/>
-          <w:bCs/>
-        </w:rPr>
-        <w:t xml:space="preserve">Alt text</w:t>
-      </w:r>
-      <w:r>
-        <w:rPr>
-          <w:rFonts w:ascii="Arial" w:cs="Arial" w:eastAsia="Arial" w:hAnsi="Arial"/>
-        </w:rPr>
-        <w:t xml:space="preserve"> or </w:t>
-      </w:r>
-      <w:r>
-        <w:rPr>
-          <w:rFonts w:ascii="Arial" w:cs="Arial" w:eastAsia="Arial" w:hAnsi="Arial"/>
-          <w:b/>
-          <w:bCs/>
-        </w:rPr>
-        <w:t xml:space="preserve">Image description</w:t>
-      </w:r>
-      <w:r>
-        <w:rPr>
-          <w:rFonts w:ascii="Arial" w:cs="Arial" w:eastAsia="Arial" w:hAnsi="Arial"/>
-        </w:rPr>
-        <w:t xml:space="preserve"> sub-field. Fill this in — it's what screen readers read out, and it's how search engines understand what the image is. One short sentence is enough: "Bobby and Scott on site at Carlton Gardens."</w:t>
-      </w:r>
-    </w:p>
     <w:tbl>
       <w:tblPr>
         <w:tblW w:type="dxa" w:w="9360"/>
@@ -4387,7 +4337,7 @@
         <w:rPr>
           <w:rFonts w:ascii="Arial" w:cs="Arial" w:eastAsia="Arial" w:hAnsi="Arial"/>
         </w:rPr>
-        <w:t xml:space="preserve">Full-bleed background photo used when Background media is set to Image. Has its own Alt text sub-field.</w:t>
+        <w:t xml:space="preserve">Full-bleed background photo used when Background media is set to Image.</w:t>
       </w:r>
     </w:p>
     <w:p>
@@ -6278,7 +6228,7 @@
         <w:rPr>
           <w:rFonts w:ascii="Arial" w:cs="Arial" w:eastAsia="Arial" w:hAnsi="Arial"/>
         </w:rPr>
-        <w:t xml:space="preserve">Editorial photograph beside / below the body. Has an Alt text sub-field.</w:t>
+        <w:t xml:space="preserve">Editorial photograph beside / below the body.</w:t>
       </w:r>
     </w:p>
     <w:p>
@@ -8163,7 +8113,7 @@
         <w:rPr>
           <w:rFonts w:ascii="Arial" w:cs="Arial" w:eastAsia="Arial" w:hAnsi="Arial"/>
         </w:rPr>
-        <w:t xml:space="preserve">Three-image scroll-driven hero. The centre image expands from ~50% width to full-bleed as the user scrolls. Each has its own Alt text.</w:t>
+        <w:t xml:space="preserve">Three-image scroll-driven hero. The centre image expands from ~50% width to full-bleed as the user scrolls.</w:t>
       </w:r>
     </w:p>
     <w:p>
@@ -10513,7 +10463,7 @@
         <w:rPr>
           <w:rFonts w:ascii="Arial" w:cs="Arial" w:eastAsia="Arial" w:hAnsi="Arial"/>
         </w:rPr>
-        <w:t xml:space="preserve">The cover image — used on the listing card, the project hero, and the first slide of the lightbox. Use "Pick from library" and pick by tag for speed. Has its own Alt text — required.</w:t>
+        <w:t xml:space="preserve">The cover image — used on the listing card, the project hero, and the first slide of the lightbox. Use "Pick from library" and pick by tag for speed.</w:t>
       </w:r>
     </w:p>
     <w:p>

</xml_diff>

<commit_message>
Move coming-soon kill switch from Home Page to Site Settings
Was per-home-page; now site-wide. When ON in Site Settings, every
route on the site renders the holding page only — header, footer,
side menu and the preloader are all skipped. The visitor's typed
URL stays unchanged, so /careers / /about / / all yield the same
holding view.

Done in the root layout (app/(site)/layout.tsx), so a single
sanityFetch on settings.comingSoon short-circuits the tree before
any page-level fetch runs.

Schema: removed comingSoon/Heading/Body from homePage, added them
to siteSettings under a new "Coming soon" tab (default-open). GROQ
queries + TS types updated to match. Editing guide regenerated.

Existing homePage docs will surface a "yellow unknown field" badge
in the studio for the orphaned values — safe to dismiss (or run
discard-drafts.mjs to clear stale drafts).

Co-Authored-By: Claude Opus 4.7 (1M context) <noreply@anthropic.com>
</commit_message>
<xml_diff>
--- a/box-3-sanity-editing-guide.docx
+++ b/box-3-sanity-editing-guide.docx
@@ -190,7 +190,7 @@
       <w:pPr>
         <w:spacing w:after="120"/>
       </w:pPr>
-      <w:hyperlink w:history="1" r:id="rIdy7jisinmbnxaxwewyjxli">
+      <w:hyperlink w:history="1" r:id="rIdudvnryicctlibe1i7yqna">
         <w:r>
           <w:rPr>
             <w:rFonts w:ascii="Arial" w:cs="Arial" w:eastAsia="Arial" w:hAnsi="Arial"/>
@@ -2234,37 +2234,48 @@
         <w:rPr>
           <w:rFonts w:ascii="Arial" w:cs="Arial" w:eastAsia="Arial" w:hAnsi="Arial"/>
         </w:rPr>
-        <w:t xml:space="preserve">Brand</w:t>
-      </w:r>
-    </w:p>
-    <w:p>
-      <w:pPr>
-        <w:pStyle w:val="ListParagraph"/>
-        <w:numPr>
-          <w:ilvl w:val="0"/>
-          <w:numId w:val="4"/>
-        </w:numPr>
-        <w:spacing w:after="100"/>
-      </w:pPr>
-      <w:r>
-        <w:rPr>
-          <w:rFonts w:ascii="Arial" w:cs="Arial" w:eastAsia="Arial" w:hAnsi="Arial"/>
-          <w:b/>
-          <w:bCs/>
-        </w:rPr>
-        <w:t xml:space="preserve">Brand name</w:t>
-      </w:r>
-      <w:r>
-        <w:rPr>
-          <w:rFonts w:ascii="Arial" w:cs="Arial" w:eastAsia="Arial" w:hAnsi="Arial"/>
-        </w:rPr>
-        <w:t xml:space="preserve"> — </w:t>
-      </w:r>
-      <w:r>
-        <w:rPr>
-          <w:rFonts w:ascii="Arial" w:cs="Arial" w:eastAsia="Arial" w:hAnsi="Arial"/>
-        </w:rPr>
-        <w:t xml:space="preserve">Used as the home logo's accessible name and in the footer copyright. Usually "Box 3 Projects".</w:t>
+        <w:t xml:space="preserve">Coming soon (site-wide kill switch)</w:t>
+      </w:r>
+    </w:p>
+    <w:p>
+      <w:pPr>
+        <w:spacing w:after="120"/>
+      </w:pPr>
+      <w:r>
+        <w:rPr>
+          <w:rFonts w:ascii="Arial" w:cs="Arial" w:eastAsia="Arial" w:hAnsi="Arial"/>
+        </w:rPr>
+        <w:t xml:space="preserve">Sits at the top of Site Settings. When ON, every page on the site — home, about, projects, careers, contact, legal, all of it — is replaced by the holding message. Useful for pre-launch holds or unscheduled maintenance. Turn OFF to bring the full site back.</w:t>
+      </w:r>
+    </w:p>
+    <w:p>
+      <w:pPr>
+        <w:pStyle w:val="ListParagraph"/>
+        <w:numPr>
+          <w:ilvl w:val="0"/>
+          <w:numId w:val="4"/>
+        </w:numPr>
+        <w:spacing w:after="100"/>
+      </w:pPr>
+      <w:r>
+        <w:rPr>
+          <w:rFonts w:ascii="Arial" w:cs="Arial" w:eastAsia="Arial" w:hAnsi="Arial"/>
+          <w:b/>
+          <w:bCs/>
+        </w:rPr>
+        <w:t xml:space="preserve">Show coming-soon page</w:t>
+      </w:r>
+      <w:r>
+        <w:rPr>
+          <w:rFonts w:ascii="Arial" w:cs="Arial" w:eastAsia="Arial" w:hAnsi="Arial"/>
+        </w:rPr>
+        <w:t xml:space="preserve"> — </w:t>
+      </w:r>
+      <w:r>
+        <w:rPr>
+          <w:rFonts w:ascii="Arial" w:cs="Arial" w:eastAsia="Arial" w:hAnsi="Arial"/>
+        </w:rPr>
+        <w:t xml:space="preserve">Toggle. ON = every page renders the holding message only. OFF = normal site.</w:t>
       </w:r>
       <w:r>
         <w:rPr>
@@ -2279,9 +2290,129 @@
           <w:iCs/>
           <w:color w:val="555555"/>
         </w:rPr>
-        <w:t xml:space="preserve">Don't change unless the brand renames.</w:t>
-      </w:r>
-    </w:p>
+        <w:t xml:space="preserve">Untick once you're live.</w:t>
+      </w:r>
+    </w:p>
+    <w:p>
+      <w:pPr>
+        <w:pStyle w:val="ListParagraph"/>
+        <w:numPr>
+          <w:ilvl w:val="0"/>
+          <w:numId w:val="4"/>
+        </w:numPr>
+        <w:spacing w:after="100"/>
+      </w:pPr>
+      <w:r>
+        <w:rPr>
+          <w:rFonts w:ascii="Arial" w:cs="Arial" w:eastAsia="Arial" w:hAnsi="Arial"/>
+          <w:b/>
+          <w:bCs/>
+        </w:rPr>
+        <w:t xml:space="preserve">Holding heading</w:t>
+      </w:r>
+      <w:r>
+        <w:rPr>
+          <w:rFonts w:ascii="Arial" w:cs="Arial" w:eastAsia="Arial" w:hAnsi="Arial"/>
+        </w:rPr>
+        <w:t xml:space="preserve"> — </w:t>
+      </w:r>
+      <w:r>
+        <w:rPr>
+          <w:rFonts w:ascii="Arial" w:cs="Arial" w:eastAsia="Arial" w:hAnsi="Arial"/>
+        </w:rPr>
+        <w:t xml:space="preserve">The big editorial line, e.g. "Site updating." Optional — defaults to a sensible value if blank.</w:t>
+      </w:r>
+    </w:p>
+    <w:p>
+      <w:pPr>
+        <w:pStyle w:val="ListParagraph"/>
+        <w:numPr>
+          <w:ilvl w:val="0"/>
+          <w:numId w:val="4"/>
+        </w:numPr>
+        <w:spacing w:after="100"/>
+      </w:pPr>
+      <w:r>
+        <w:rPr>
+          <w:rFonts w:ascii="Arial" w:cs="Arial" w:eastAsia="Arial" w:hAnsi="Arial"/>
+          <w:b/>
+          <w:bCs/>
+        </w:rPr>
+        <w:t xml:space="preserve">Holding message</w:t>
+      </w:r>
+      <w:r>
+        <w:rPr>
+          <w:rFonts w:ascii="Arial" w:cs="Arial" w:eastAsia="Arial" w:hAnsi="Arial"/>
+        </w:rPr>
+        <w:t xml:space="preserve"> — </w:t>
+      </w:r>
+      <w:r>
+        <w:rPr>
+          <w:rFonts w:ascii="Arial" w:cs="Arial" w:eastAsia="Arial" w:hAnsi="Arial"/>
+        </w:rPr>
+        <w:t xml:space="preserve">Supporting paragraph beneath the heading.</w:t>
+      </w:r>
+    </w:p>
+    <w:tbl>
+      <w:tblPr>
+        <w:tblW w:type="dxa" w:w="9360"/>
+        <w:tblBorders>
+          <w:top w:val="single" w:color="auto" w:sz="4"/>
+          <w:left w:val="single" w:color="auto" w:sz="4"/>
+          <w:bottom w:val="single" w:color="auto" w:sz="4"/>
+          <w:right w:val="single" w:color="auto" w:sz="4"/>
+          <w:insideH w:val="single" w:color="auto" w:sz="4"/>
+          <w:insideV w:val="single" w:color="auto" w:sz="4"/>
+        </w:tblBorders>
+      </w:tblPr>
+      <w:tblGrid>
+        <w:gridCol w:w="9360"/>
+      </w:tblGrid>
+      <w:tr>
+        <w:tc>
+          <w:tcPr>
+            <w:tcW w:type="dxa" w:w="9360"/>
+            <w:tcBorders>
+              <w:top w:val="single" w:color="2E75B6" w:sz="6"/>
+              <w:left w:val="single" w:color="2E75B6" w:sz="6"/>
+              <w:bottom w:val="single" w:color="2E75B6" w:sz="6"/>
+              <w:right w:val="single" w:color="2E75B6" w:sz="6"/>
+            </w:tcBorders>
+            <w:shd w:fill="F4F1EE" w:val="clear"/>
+            <w:tcMar>
+              <w:top w:type="dxa" w:w="120"/>
+              <w:left w:type="dxa" w:w="200"/>
+              <w:bottom w:type="dxa" w:w="120"/>
+              <w:right w:type="dxa" w:w="200"/>
+            </w:tcMar>
+          </w:tcPr>
+          <w:p>
+            <w:pPr>
+              <w:spacing w:after="80"/>
+            </w:pPr>
+            <w:r>
+              <w:rPr>
+                <w:rFonts w:ascii="Arial" w:cs="Arial" w:eastAsia="Arial" w:hAnsi="Arial"/>
+                <w:b/>
+                <w:bCs/>
+                <w:color w:val="2E75B6"/>
+                <w:sz w:val="22"/>
+                <w:szCs w:val="22"/>
+              </w:rPr>
+              <w:t xml:space="preserve">What gets hidden</w:t>
+            </w:r>
+          </w:p>
+          <w:p>
+            <w:r>
+              <w:rPr>
+                <w:rFonts w:ascii="Arial" w:cs="Arial" w:eastAsia="Arial" w:hAnsi="Arial"/>
+              </w:rPr>
+              <w:t xml:space="preserve">Header, footer, side menu, and the preloader are all skipped while the kill switch is ON — visitors only see the holding page no matter which URL they typed.</w:t>
+            </w:r>
+          </w:p>
+        </w:tc>
+      </w:tr>
+    </w:tbl>
     <w:p>
       <w:pPr>
         <w:pStyle w:val="Heading2"/>
@@ -2290,37 +2421,37 @@
         <w:rPr>
           <w:rFonts w:ascii="Arial" w:cs="Arial" w:eastAsia="Arial" w:hAnsi="Arial"/>
         </w:rPr>
-        <w:t xml:space="preserve">Header</w:t>
-      </w:r>
-    </w:p>
-    <w:p>
-      <w:pPr>
-        <w:pStyle w:val="ListParagraph"/>
-        <w:numPr>
-          <w:ilvl w:val="0"/>
-          <w:numId w:val="4"/>
-        </w:numPr>
-        <w:spacing w:after="100"/>
-      </w:pPr>
-      <w:r>
-        <w:rPr>
-          <w:rFonts w:ascii="Arial" w:cs="Arial" w:eastAsia="Arial" w:hAnsi="Arial"/>
-          <w:b/>
-          <w:bCs/>
-        </w:rPr>
-        <w:t xml:space="preserve">Primary nav links</w:t>
-      </w:r>
-      <w:r>
-        <w:rPr>
-          <w:rFonts w:ascii="Arial" w:cs="Arial" w:eastAsia="Arial" w:hAnsi="Arial"/>
-        </w:rPr>
-        <w:t xml:space="preserve"> — </w:t>
-      </w:r>
-      <w:r>
-        <w:rPr>
-          <w:rFonts w:ascii="Arial" w:cs="Arial" w:eastAsia="Arial" w:hAnsi="Arial"/>
-        </w:rPr>
-        <w:t xml:space="preserve">First column of nav links beside the logo. Up to 6 entries.</w:t>
+        <w:t xml:space="preserve">Brand</w:t>
+      </w:r>
+    </w:p>
+    <w:p>
+      <w:pPr>
+        <w:pStyle w:val="ListParagraph"/>
+        <w:numPr>
+          <w:ilvl w:val="0"/>
+          <w:numId w:val="4"/>
+        </w:numPr>
+        <w:spacing w:after="100"/>
+      </w:pPr>
+      <w:r>
+        <w:rPr>
+          <w:rFonts w:ascii="Arial" w:cs="Arial" w:eastAsia="Arial" w:hAnsi="Arial"/>
+          <w:b/>
+          <w:bCs/>
+        </w:rPr>
+        <w:t xml:space="preserve">Brand name</w:t>
+      </w:r>
+      <w:r>
+        <w:rPr>
+          <w:rFonts w:ascii="Arial" w:cs="Arial" w:eastAsia="Arial" w:hAnsi="Arial"/>
+        </w:rPr>
+        <w:t xml:space="preserve"> — </w:t>
+      </w:r>
+      <w:r>
+        <w:rPr>
+          <w:rFonts w:ascii="Arial" w:cs="Arial" w:eastAsia="Arial" w:hAnsi="Arial"/>
+        </w:rPr>
+        <w:t xml:space="preserve">Used as the home logo's accessible name and in the footer copyright. Usually "Box 3 Projects".</w:t>
       </w:r>
       <w:r>
         <w:rPr>
@@ -2335,6 +2466,62 @@
           <w:iCs/>
           <w:color w:val="555555"/>
         </w:rPr>
+        <w:t xml:space="preserve">Don't change unless the brand renames.</w:t>
+      </w:r>
+    </w:p>
+    <w:p>
+      <w:pPr>
+        <w:pStyle w:val="Heading2"/>
+      </w:pPr>
+      <w:r>
+        <w:rPr>
+          <w:rFonts w:ascii="Arial" w:cs="Arial" w:eastAsia="Arial" w:hAnsi="Arial"/>
+        </w:rPr>
+        <w:t xml:space="preserve">Header</w:t>
+      </w:r>
+    </w:p>
+    <w:p>
+      <w:pPr>
+        <w:pStyle w:val="ListParagraph"/>
+        <w:numPr>
+          <w:ilvl w:val="0"/>
+          <w:numId w:val="4"/>
+        </w:numPr>
+        <w:spacing w:after="100"/>
+      </w:pPr>
+      <w:r>
+        <w:rPr>
+          <w:rFonts w:ascii="Arial" w:cs="Arial" w:eastAsia="Arial" w:hAnsi="Arial"/>
+          <w:b/>
+          <w:bCs/>
+        </w:rPr>
+        <w:t xml:space="preserve">Primary nav links</w:t>
+      </w:r>
+      <w:r>
+        <w:rPr>
+          <w:rFonts w:ascii="Arial" w:cs="Arial" w:eastAsia="Arial" w:hAnsi="Arial"/>
+        </w:rPr>
+        <w:t xml:space="preserve"> — </w:t>
+      </w:r>
+      <w:r>
+        <w:rPr>
+          <w:rFonts w:ascii="Arial" w:cs="Arial" w:eastAsia="Arial" w:hAnsi="Arial"/>
+        </w:rPr>
+        <w:t xml:space="preserve">First column of nav links beside the logo. Up to 6 entries.</w:t>
+      </w:r>
+      <w:r>
+        <w:rPr>
+          <w:rFonts w:ascii="Arial" w:cs="Arial" w:eastAsia="Arial" w:hAnsi="Arial"/>
+        </w:rPr>
+        <w:t xml:space="preserve"> </w:t>
+      </w:r>
+      <w:r>
+        <w:rPr>
+          <w:rFonts w:ascii="Arial" w:cs="Arial" w:eastAsia="Arial" w:hAnsi="Arial"/>
+          <w:i/>
+          <w:iCs/>
+          <w:color w:val="555555"/>
+        </w:rPr>
         <w:t xml:space="preserve">Each link has a label, an href (the path on the site), and an optional page name shown briefly during page transitions.</w:t>
       </w:r>
     </w:p>
@@ -4120,123 +4307,7 @@
         <w:rPr>
           <w:rFonts w:ascii="Arial" w:cs="Arial" w:eastAsia="Arial" w:hAnsi="Arial"/>
         </w:rPr>
-        <w:t xml:space="preserve">Tabs: Coming soon · Hero · About statement · Introducing · Services · Featured projects · Stats · Why Box 3 · Testimonials · Final CTA · SEO.</w:t>
-      </w:r>
-    </w:p>
-    <w:p>
-      <w:pPr>
-        <w:pStyle w:val="Heading3"/>
-      </w:pPr>
-      <w:r>
-        <w:rPr>
-          <w:rFonts w:ascii="Arial" w:cs="Arial" w:eastAsia="Arial" w:hAnsi="Arial"/>
-        </w:rPr>
-        <w:t xml:space="preserve">Coming soon</w:t>
-      </w:r>
-    </w:p>
-    <w:p>
-      <w:pPr>
-        <w:pStyle w:val="ListParagraph"/>
-        <w:numPr>
-          <w:ilvl w:val="0"/>
-          <w:numId w:val="4"/>
-        </w:numPr>
-        <w:spacing w:after="100"/>
-      </w:pPr>
-      <w:r>
-        <w:rPr>
-          <w:rFonts w:ascii="Arial" w:cs="Arial" w:eastAsia="Arial" w:hAnsi="Arial"/>
-          <w:b/>
-          <w:bCs/>
-        </w:rPr>
-        <w:t xml:space="preserve">Coming soon enabled</w:t>
-      </w:r>
-      <w:r>
-        <w:rPr>
-          <w:rFonts w:ascii="Arial" w:cs="Arial" w:eastAsia="Arial" w:hAnsi="Arial"/>
-        </w:rPr>
-        <w:t xml:space="preserve"> — </w:t>
-      </w:r>
-      <w:r>
-        <w:rPr>
-          <w:rFonts w:ascii="Arial" w:cs="Arial" w:eastAsia="Arial" w:hAnsi="Arial"/>
-        </w:rPr>
-        <w:t xml:space="preserve">Tick to replace the home page with a holding page. Useful before launch.</w:t>
-      </w:r>
-      <w:r>
-        <w:rPr>
-          <w:rFonts w:ascii="Arial" w:cs="Arial" w:eastAsia="Arial" w:hAnsi="Arial"/>
-        </w:rPr>
-        <w:t xml:space="preserve"> </w:t>
-      </w:r>
-      <w:r>
-        <w:rPr>
-          <w:rFonts w:ascii="Arial" w:cs="Arial" w:eastAsia="Arial" w:hAnsi="Arial"/>
-          <w:i/>
-          <w:iCs/>
-          <w:color w:val="555555"/>
-        </w:rPr>
-        <w:t xml:space="preserve">Untick once you go live.</w:t>
-      </w:r>
-    </w:p>
-    <w:p>
-      <w:pPr>
-        <w:pStyle w:val="ListParagraph"/>
-        <w:numPr>
-          <w:ilvl w:val="0"/>
-          <w:numId w:val="4"/>
-        </w:numPr>
-        <w:spacing w:after="100"/>
-      </w:pPr>
-      <w:r>
-        <w:rPr>
-          <w:rFonts w:ascii="Arial" w:cs="Arial" w:eastAsia="Arial" w:hAnsi="Arial"/>
-          <w:b/>
-          <w:bCs/>
-        </w:rPr>
-        <w:t xml:space="preserve">Coming soon heading</w:t>
-      </w:r>
-      <w:r>
-        <w:rPr>
-          <w:rFonts w:ascii="Arial" w:cs="Arial" w:eastAsia="Arial" w:hAnsi="Arial"/>
-        </w:rPr>
-        <w:t xml:space="preserve"> — </w:t>
-      </w:r>
-      <w:r>
-        <w:rPr>
-          <w:rFonts w:ascii="Arial" w:cs="Arial" w:eastAsia="Arial" w:hAnsi="Arial"/>
-        </w:rPr>
-        <w:t xml:space="preserve">Big heading on the holding page.</w:t>
-      </w:r>
-    </w:p>
-    <w:p>
-      <w:pPr>
-        <w:pStyle w:val="ListParagraph"/>
-        <w:numPr>
-          <w:ilvl w:val="0"/>
-          <w:numId w:val="4"/>
-        </w:numPr>
-        <w:spacing w:after="100"/>
-      </w:pPr>
-      <w:r>
-        <w:rPr>
-          <w:rFonts w:ascii="Arial" w:cs="Arial" w:eastAsia="Arial" w:hAnsi="Arial"/>
-          <w:b/>
-          <w:bCs/>
-        </w:rPr>
-        <w:t xml:space="preserve">Coming soon body</w:t>
-      </w:r>
-      <w:r>
-        <w:rPr>
-          <w:rFonts w:ascii="Arial" w:cs="Arial" w:eastAsia="Arial" w:hAnsi="Arial"/>
-        </w:rPr>
-        <w:t xml:space="preserve"> — </w:t>
-      </w:r>
-      <w:r>
-        <w:rPr>
-          <w:rFonts w:ascii="Arial" w:cs="Arial" w:eastAsia="Arial" w:hAnsi="Arial"/>
-        </w:rPr>
-        <w:t xml:space="preserve">Supporting copy under the heading.</w:t>
+        <w:t xml:space="preserve">Tabs: Hero · About statement · Introducing · Services · Featured projects · Stats · Why Box 3 · Testimonials · Final CTA · SEO.</w:t>
       </w:r>
     </w:p>
     <w:p>

</xml_diff>

<commit_message>
Add Internal page dropdown to the link object
Editors no longer have to type slugs for site pages. The link object
now offers:

  - Internal page: dropdown of the 7 top-level routes (Home, About,
    Services, Projects, Careers, Sustainability, Contact). Pick one
    and you're done.
  - Custom link: the old free-text field. Use for external URLs,
    mailto:, tel:, in-page anchors — anything outside the dropdown.

If both are set, Internal page wins. GROQ projections coalesce
internalPage → href so the front-end always sees a single resolved
href. Existing links with just an href keep working — no migration.

The doc-level validation requires at least one of internalPage or
href to be set, otherwise the link goes nowhere.

Editing guide updated with a callout explaining the two paths.

Co-Authored-By: Claude Opus 4.7 (1M context) <noreply@anthropic.com>
</commit_message>
<xml_diff>
--- a/box-3-sanity-editing-guide.docx
+++ b/box-3-sanity-editing-guide.docx
@@ -190,7 +190,7 @@
       <w:pPr>
         <w:spacing w:after="120"/>
       </w:pPr>
-      <w:hyperlink w:history="1" r:id="rIdudvnryicctlibe1i7yqna">
+      <w:hyperlink w:history="1" r:id="rIdhhjbc_hqznubguluzugw7">
         <w:r>
           <w:rPr>
             <w:rFonts w:ascii="Arial" w:cs="Arial" w:eastAsia="Arial" w:hAnsi="Arial"/>
@@ -2480,6 +2480,66 @@
         <w:t xml:space="preserve">Header</w:t>
       </w:r>
     </w:p>
+    <w:tbl>
+      <w:tblPr>
+        <w:tblW w:type="dxa" w:w="9360"/>
+        <w:tblBorders>
+          <w:top w:val="single" w:color="auto" w:sz="4"/>
+          <w:left w:val="single" w:color="auto" w:sz="4"/>
+          <w:bottom w:val="single" w:color="auto" w:sz="4"/>
+          <w:right w:val="single" w:color="auto" w:sz="4"/>
+          <w:insideH w:val="single" w:color="auto" w:sz="4"/>
+          <w:insideV w:val="single" w:color="auto" w:sz="4"/>
+        </w:tblBorders>
+      </w:tblPr>
+      <w:tblGrid>
+        <w:gridCol w:w="9360"/>
+      </w:tblGrid>
+      <w:tr>
+        <w:tc>
+          <w:tcPr>
+            <w:tcW w:type="dxa" w:w="9360"/>
+            <w:tcBorders>
+              <w:top w:val="single" w:color="2E75B6" w:sz="6"/>
+              <w:left w:val="single" w:color="2E75B6" w:sz="6"/>
+              <w:bottom w:val="single" w:color="2E75B6" w:sz="6"/>
+              <w:right w:val="single" w:color="2E75B6" w:sz="6"/>
+            </w:tcBorders>
+            <w:shd w:fill="F4F1EE" w:val="clear"/>
+            <w:tcMar>
+              <w:top w:type="dxa" w:w="120"/>
+              <w:left w:type="dxa" w:w="200"/>
+              <w:bottom w:type="dxa" w:w="120"/>
+              <w:right w:type="dxa" w:w="200"/>
+            </w:tcMar>
+          </w:tcPr>
+          <w:p>
+            <w:pPr>
+              <w:spacing w:after="80"/>
+            </w:pPr>
+            <w:r>
+              <w:rPr>
+                <w:rFonts w:ascii="Arial" w:cs="Arial" w:eastAsia="Arial" w:hAnsi="Arial"/>
+                <w:b/>
+                <w:bCs/>
+                <w:color w:val="2E75B6"/>
+                <w:sz w:val="22"/>
+                <w:szCs w:val="22"/>
+              </w:rPr>
+              <w:t xml:space="preserve">How a link field works</w:t>
+            </w:r>
+          </w:p>
+          <w:p>
+            <w:r>
+              <w:rPr>
+                <w:rFonts w:ascii="Arial" w:cs="Arial" w:eastAsia="Arial" w:hAnsi="Arial"/>
+              </w:rPr>
+              <w:t xml:space="preserve">Every link field on the site (nav items, footer columns, CTAs, buttons) shares the same shape: a Label, then either an Internal page dropdown (Home / About / Services / etc.) or a Custom link text field for external URLs (https://…), email (mailto:…), phone (tel:…), or in-page anchors (#process). Use the dropdown for site pages — no need to type the slug. The Custom link field is only for things outside the dropdown. If both are set, the dropdown wins. There's also an optional Transition label shown briefly during the page-transition wipe.</w:t>
+            </w:r>
+          </w:p>
+        </w:tc>
+      </w:tr>
+    </w:tbl>
     <w:p>
       <w:pPr>
         <w:pStyle w:val="ListParagraph"/>
@@ -2508,21 +2568,6 @@
           <w:rFonts w:ascii="Arial" w:cs="Arial" w:eastAsia="Arial" w:hAnsi="Arial"/>
         </w:rPr>
         <w:t xml:space="preserve">First column of nav links beside the logo. Up to 6 entries.</w:t>
-      </w:r>
-      <w:r>
-        <w:rPr>
-          <w:rFonts w:ascii="Arial" w:cs="Arial" w:eastAsia="Arial" w:hAnsi="Arial"/>
-        </w:rPr>
-        <w:t xml:space="preserve"> </w:t>
-      </w:r>
-      <w:r>
-        <w:rPr>
-          <w:rFonts w:ascii="Arial" w:cs="Arial" w:eastAsia="Arial" w:hAnsi="Arial"/>
-          <w:i/>
-          <w:iCs/>
-          <w:color w:val="555555"/>
-        </w:rPr>
-        <w:t xml:space="preserve">Each link has a label, an href (the path on the site), and an optional page name shown briefly during page transitions.</w:t>
       </w:r>
     </w:p>
     <w:p>

</xml_diff>

<commit_message>
Add editable hero images to About page
The /about hero rendered three images, but they came from the
ImageStripHero component's hardcoded fallbacks — the aboutPage
schema only had title + CTA, so the client had no way to swap them.

Added the same three-image hero fields the careers + sustainability
pages already have:
  - heroImageLeft   — context shot, left of the strip
  - heroImageCentre — expands from ~50% width to full-bleed
  - heroImageRight  — context shot, right of the strip

All three use the TaggedMediaPicker (Pick from library) for the
consistent media workflow. GROQ projection, TS interface and the
page consumer wired up. Editing guide refreshed to match.

Co-Authored-By: Claude Opus 4.7 (1M context) <noreply@anthropic.com>
</commit_message>
<xml_diff>
--- a/box-3-sanity-editing-guide.docx
+++ b/box-3-sanity-editing-guide.docx
@@ -190,7 +190,7 @@
       <w:pPr>
         <w:spacing w:after="120"/>
       </w:pPr>
-      <w:hyperlink w:history="1" r:id="rIdqotapgg9sgjtn1civbny6">
+      <w:hyperlink w:history="1" r:id="rIdm7l0mqn-tc9thsr3w8srz">
         <w:r>
           <w:rPr>
             <w:rFonts w:ascii="Arial" w:cs="Arial" w:eastAsia="Arial" w:hAnsi="Arial"/>
@@ -5486,6 +5486,36 @@
           <w:rFonts w:ascii="Arial" w:cs="Arial" w:eastAsia="Arial" w:hAnsi="Arial"/>
         </w:rPr>
         <w:t xml:space="preserve">Optional CTA pinned beside the title — label + link + page name. Often points to #team to anchor down to the team grid.</w:t>
+      </w:r>
+    </w:p>
+    <w:p>
+      <w:pPr>
+        <w:pStyle w:val="ListParagraph"/>
+        <w:numPr>
+          <w:ilvl w:val="0"/>
+          <w:numId w:val="4"/>
+        </w:numPr>
+        <w:spacing w:after="100"/>
+      </w:pPr>
+      <w:r>
+        <w:rPr>
+          <w:rFonts w:ascii="Arial" w:cs="Arial" w:eastAsia="Arial" w:hAnsi="Arial"/>
+          <w:b/>
+          <w:bCs/>
+        </w:rPr>
+        <w:t xml:space="preserve">Hero image — left / centre / right</w:t>
+      </w:r>
+      <w:r>
+        <w:rPr>
+          <w:rFonts w:ascii="Arial" w:cs="Arial" w:eastAsia="Arial" w:hAnsi="Arial"/>
+        </w:rPr>
+        <w:t xml:space="preserve"> — </w:t>
+      </w:r>
+      <w:r>
+        <w:rPr>
+          <w:rFonts w:ascii="Arial" w:cs="Arial" w:eastAsia="Arial" w:hAnsi="Arial"/>
+        </w:rPr>
+        <w:t xml:space="preserve">Three-image scroll-driven hero (same pattern as Careers + Sustainability). The centre image expands from ~50% width to full-bleed as the user scrolls.</w:t>
       </w:r>
     </w:p>
     <w:p>

</xml_diff>

<commit_message>
Add editable hero images to Services page
Same gap the About page had: /services renders three hero images
via ImageStripHero, but the schema didn't expose them — they came
from the component's hardcoded fallbacks, so the editor had no way
to swap them.

Added the three matching fields (left / centre / right) — same
pattern as About, Careers and Sustainability now. All three use
the TaggedMediaPicker for the consistent media workflow. Query +
TS interface + page consumer wired up. Editing guide refreshed.

Co-Authored-By: Claude Opus 4.7 (1M context) <noreply@anthropic.com>
</commit_message>
<xml_diff>
--- a/box-3-sanity-editing-guide.docx
+++ b/box-3-sanity-editing-guide.docx
@@ -190,7 +190,7 @@
       <w:pPr>
         <w:spacing w:after="120"/>
       </w:pPr>
-      <w:hyperlink w:history="1" r:id="rIdm7l0mqn-tc9thsr3w8srz">
+      <w:hyperlink w:history="1" r:id="rIdd6plv5fzmwekogzfezbjg">
         <w:r>
           <w:rPr>
             <w:rFonts w:ascii="Arial" w:cs="Arial" w:eastAsia="Arial" w:hAnsi="Arial"/>
@@ -6118,6 +6118,36 @@
           <w:rFonts w:ascii="Arial" w:cs="Arial" w:eastAsia="Arial" w:hAnsi="Arial"/>
         </w:rPr>
         <w:t xml:space="preserve">Optional CTA — label + link + page name. Often a fragment href like #process to scroll to a section.</w:t>
+      </w:r>
+    </w:p>
+    <w:p>
+      <w:pPr>
+        <w:pStyle w:val="ListParagraph"/>
+        <w:numPr>
+          <w:ilvl w:val="0"/>
+          <w:numId w:val="4"/>
+        </w:numPr>
+        <w:spacing w:after="100"/>
+      </w:pPr>
+      <w:r>
+        <w:rPr>
+          <w:rFonts w:ascii="Arial" w:cs="Arial" w:eastAsia="Arial" w:hAnsi="Arial"/>
+          <w:b/>
+          <w:bCs/>
+        </w:rPr>
+        <w:t xml:space="preserve">Hero image — left / centre / right</w:t>
+      </w:r>
+      <w:r>
+        <w:rPr>
+          <w:rFonts w:ascii="Arial" w:cs="Arial" w:eastAsia="Arial" w:hAnsi="Arial"/>
+        </w:rPr>
+        <w:t xml:space="preserve"> — </w:t>
+      </w:r>
+      <w:r>
+        <w:rPr>
+          <w:rFonts w:ascii="Arial" w:cs="Arial" w:eastAsia="Arial" w:hAnsi="Arial"/>
+        </w:rPr>
+        <w:t xml:space="preserve">Three-image scroll-driven hero (same pattern as About + Careers + Sustainability). The centre image expands from ~50% width to full-bleed as the user scrolls.</w:t>
       </w:r>
     </w:p>
     <w:p>

</xml_diff>